<commit_message>
Actualizacion a la clase 4
</commit_message>
<xml_diff>
--- a/Clase01/Informacion sobre la cursada.docx
+++ b/Clase01/Informacion sobre la cursada.docx
@@ -213,8 +213,30 @@
       <w:r>
         <w:t xml:space="preserve">Para practicar Git </w:t>
       </w:r>
-      <w:r>
-        <w:t>https://learngitbranching.js.org/</w:t>
+      <w:hyperlink r:id="rId9" w:history="1">
+        <w:r>
+          <w:rPr>
+            <w:rStyle w:val="Hipervnculo"/>
+          </w:rPr>
+          <w:t>https://learngitbranching.js.org/</w:t>
+        </w:r>
+      </w:hyperlink>
+    </w:p>
+    <w:p/>
+    <w:p>
+      <w:hyperlink r:id="rId10" w:history="1">
+        <w:r>
+          <w:rPr>
+            <w:rStyle w:val="Hipervnculo"/>
+          </w:rPr>
+          <w:t>https://flexboxfroggy.com/#es</w:t>
+        </w:r>
+      </w:hyperlink>
+    </w:p>
+    <w:p/>
+    <w:p>
+      <w:r>
+        <w:t>Importante flex</w:t>
       </w:r>
     </w:p>
     <w:sectPr>

</xml_diff>